<commit_message>
bổ sung tài liệu
</commit_message>
<xml_diff>
--- a/Tài Liệu/0.Mở đầu.docx
+++ b/Tài Liệu/0.Mở đầu.docx
@@ -1,6 +1,6 @@
 
 <file path=word/document.xml><?xml version="1.0" encoding="utf-8"?>
-<w:document xmlns:wpc="http://schemas.microsoft.com/office/word/2010/wordprocessingCanvas" xmlns:cx="http://schemas.microsoft.com/office/drawing/2014/chartex" xmlns:mc="http://schemas.openxmlformats.org/markup-compatibility/2006" xmlns:o="urn:schemas-microsoft-com:office:office" xmlns:r="http://schemas.openxmlformats.org/officeDocument/2006/relationships" xmlns:m="http://schemas.openxmlformats.org/officeDocument/2006/math" xmlns:v="urn:schemas-microsoft-com:vml" xmlns:wp14="http://schemas.microsoft.com/office/word/2010/wordprocessingDrawing" xmlns:wp="http://schemas.openxmlformats.org/drawingml/2006/wordprocessingDrawing" xmlns:w10="urn:schemas-microsoft-com:office:word" xmlns:w="http://schemas.openxmlformats.org/wordprocessingml/2006/main" xmlns:w14="http://schemas.microsoft.com/office/word/2010/wordml" xmlns:w15="http://schemas.microsoft.com/office/word/2012/wordml" xmlns:w16se="http://schemas.microsoft.com/office/word/2015/wordml/symex" xmlns:wpg="http://schemas.microsoft.com/office/word/2010/wordprocessingGroup" xmlns:wpi="http://schemas.microsoft.com/office/word/2010/wordprocessingInk" xmlns:wne="http://schemas.microsoft.com/office/word/2006/wordml" xmlns:wps="http://schemas.microsoft.com/office/word/2010/wordprocessingShape" mc:Ignorable="w14 w15 w16se wp14">
+<w:document xmlns:wpc="http://schemas.microsoft.com/office/word/2010/wordprocessingCanvas" xmlns:cx="http://schemas.microsoft.com/office/drawing/2014/chartex" xmlns:cx1="http://schemas.microsoft.com/office/drawing/2015/9/8/chartex" xmlns:cx2="http://schemas.microsoft.com/office/drawing/2015/10/21/chartex" xmlns:cx3="http://schemas.microsoft.com/office/drawing/2016/5/9/chartex" xmlns:cx4="http://schemas.microsoft.com/office/drawing/2016/5/10/chartex" xmlns:cx5="http://schemas.microsoft.com/office/drawing/2016/5/11/chartex" xmlns:cx6="http://schemas.microsoft.com/office/drawing/2016/5/12/chartex" xmlns:cx7="http://schemas.microsoft.com/office/drawing/2016/5/13/chartex" xmlns:cx8="http://schemas.microsoft.com/office/drawing/2016/5/14/chartex" xmlns:mc="http://schemas.openxmlformats.org/markup-compatibility/2006" xmlns:aink="http://schemas.microsoft.com/office/drawing/2016/ink" xmlns:am3d="http://schemas.microsoft.com/office/drawing/2017/model3d" xmlns:o="urn:schemas-microsoft-com:office:office" xmlns:oel="http://schemas.microsoft.com/office/2019/extlst" xmlns:r="http://schemas.openxmlformats.org/officeDocument/2006/relationships" xmlns:m="http://schemas.openxmlformats.org/officeDocument/2006/math" xmlns:v="urn:schemas-microsoft-com:vml" xmlns:wp14="http://schemas.microsoft.com/office/word/2010/wordprocessingDrawing" xmlns:wp="http://schemas.openxmlformats.org/drawingml/2006/wordprocessingDrawing" xmlns:w10="urn:schemas-microsoft-com:office:word" xmlns:w="http://schemas.openxmlformats.org/wordprocessingml/2006/main" xmlns:w14="http://schemas.microsoft.com/office/word/2010/wordml" xmlns:w15="http://schemas.microsoft.com/office/word/2012/wordml" xmlns:w16cex="http://schemas.microsoft.com/office/word/2018/wordml/cex" xmlns:w16cid="http://schemas.microsoft.com/office/word/2016/wordml/cid" xmlns:w16="http://schemas.microsoft.com/office/word/2018/wordml" xmlns:w16du="http://schemas.microsoft.com/office/word/2023/wordml/word16du" xmlns:w16sdtdh="http://schemas.microsoft.com/office/word/2020/wordml/sdtdatahash" xmlns:w16sdtfl="http://schemas.microsoft.com/office/word/2024/wordml/sdtformatlock" xmlns:w16se="http://schemas.microsoft.com/office/word/2015/wordml/symex" xmlns:wpg="http://schemas.microsoft.com/office/word/2010/wordprocessingGroup" xmlns:wpi="http://schemas.microsoft.com/office/word/2010/wordprocessingInk" xmlns:wne="http://schemas.microsoft.com/office/word/2006/wordml" xmlns:wps="http://schemas.microsoft.com/office/word/2010/wordprocessingShape" mc:Ignorable="w14 w15 w16se w16cid w16 w16cex w16sdtdh w16sdtfl w16du wp14">
   <w:body>
     <w:p>
       <w:pPr>
@@ -99,7 +99,7 @@
           <w:lang w:val="vi-VN" w:eastAsia="vi-VN"/>
         </w:rPr>
         <w:drawing>
-          <wp:inline distT="0" distB="0" distL="0" distR="0" wp14:anchorId="21EBB395" wp14:editId="6A55265B">
+          <wp:inline distT="0" distB="0" distL="0" distR="0" wp14:anchorId="5F681B6D" wp14:editId="37F1131E">
             <wp:extent cx="828675" cy="762000"/>
             <wp:effectExtent l="0" t="0" r="9525" b="0"/>
             <wp:docPr id="1" name="Picture 1"/>
@@ -316,6 +316,7 @@
           <w:b/>
           <w:sz w:val="38"/>
           <w:szCs w:val="52"/>
+          <w:lang w:val="vi-VN"/>
         </w:rPr>
       </w:pPr>
     </w:p>
@@ -333,6 +334,7 @@
           <w:b/>
           <w:sz w:val="32"/>
           <w:szCs w:val="32"/>
+          <w:lang w:val="vi-VN"/>
         </w:rPr>
       </w:pPr>
     </w:p>
@@ -350,6 +352,7 @@
           <w:b/>
           <w:sz w:val="32"/>
           <w:szCs w:val="32"/>
+          <w:lang w:val="vi-VN"/>
         </w:rPr>
       </w:pPr>
     </w:p>
@@ -367,6 +370,7 @@
           <w:b/>
           <w:sz w:val="32"/>
           <w:szCs w:val="32"/>
+          <w:lang w:val="vi-VN"/>
         </w:rPr>
       </w:pPr>
     </w:p>
@@ -384,14 +388,16 @@
           <w:b/>
           <w:sz w:val="32"/>
           <w:szCs w:val="32"/>
-        </w:rPr>
-      </w:pPr>
-      <w:r>
-        <w:rPr>
-          <w:rFonts w:ascii="Times New Roman" w:hAnsi="Times New Roman" w:cs="Times New Roman"/>
-          <w:b/>
-          <w:sz w:val="32"/>
-          <w:szCs w:val="32"/>
+          <w:lang w:val="vi-VN"/>
+        </w:rPr>
+      </w:pPr>
+      <w:r>
+        <w:rPr>
+          <w:rFonts w:ascii="Times New Roman" w:hAnsi="Times New Roman" w:cs="Times New Roman"/>
+          <w:b/>
+          <w:sz w:val="32"/>
+          <w:szCs w:val="32"/>
+          <w:lang w:val="vi-VN"/>
         </w:rPr>
         <w:t>KHÓA LUẬN CỬ NHÂN CÔNG NGHỆ THÔNG TIN</w:t>
       </w:r>
@@ -410,6 +416,7 @@
           <w:b/>
           <w:sz w:val="32"/>
           <w:szCs w:val="32"/>
+          <w:lang w:val="vi-VN"/>
         </w:rPr>
       </w:pPr>
     </w:p>
@@ -427,6 +434,7 @@
           <w:b/>
           <w:sz w:val="32"/>
           <w:szCs w:val="32"/>
+          <w:lang w:val="vi-VN"/>
         </w:rPr>
       </w:pPr>
     </w:p>
@@ -444,6 +452,7 @@
           <w:b/>
           <w:sz w:val="32"/>
           <w:szCs w:val="32"/>
+          <w:lang w:val="vi-VN"/>
         </w:rPr>
       </w:pPr>
     </w:p>
@@ -461,6 +470,7 @@
           <w:b/>
           <w:sz w:val="32"/>
           <w:szCs w:val="32"/>
+          <w:lang w:val="vi-VN"/>
         </w:rPr>
       </w:pPr>
     </w:p>
@@ -477,13 +487,15 @@
           <w:rFonts w:ascii="Times New Roman" w:hAnsi="Times New Roman" w:cs="Times New Roman"/>
           <w:sz w:val="32"/>
           <w:szCs w:val="32"/>
-        </w:rPr>
-      </w:pPr>
-      <w:r>
-        <w:rPr>
-          <w:rFonts w:ascii="Times New Roman" w:hAnsi="Times New Roman" w:cs="Times New Roman"/>
-          <w:sz w:val="32"/>
-          <w:szCs w:val="32"/>
+          <w:lang w:val="vi-VN"/>
+        </w:rPr>
+      </w:pPr>
+      <w:r>
+        <w:rPr>
+          <w:rFonts w:ascii="Times New Roman" w:hAnsi="Times New Roman" w:cs="Times New Roman"/>
+          <w:sz w:val="32"/>
+          <w:szCs w:val="32"/>
+          <w:lang w:val="vi-VN"/>
         </w:rPr>
         <w:t>Đà Nẵ</w:t>
       </w:r>
@@ -492,6 +504,7 @@
           <w:rFonts w:ascii="Times New Roman" w:hAnsi="Times New Roman" w:cs="Times New Roman"/>
           <w:sz w:val="32"/>
           <w:szCs w:val="32"/>
+          <w:lang w:val="vi-VN"/>
         </w:rPr>
         <w:t xml:space="preserve">ng, </w:t>
       </w:r>
@@ -518,6 +531,7 @@
           <w:rFonts w:ascii="Times New Roman" w:hAnsi="Times New Roman" w:cs="Times New Roman"/>
           <w:sz w:val="32"/>
           <w:szCs w:val="32"/>
+          <w:lang w:val="vi-VN"/>
         </w:rPr>
       </w:pPr>
     </w:p>
@@ -555,6 +569,7 @@
           <w:b/>
           <w:sz w:val="36"/>
           <w:szCs w:val="36"/>
+          <w:lang w:val="vi-VN"/>
         </w:rPr>
       </w:pPr>
       <w:r>
@@ -563,6 +578,7 @@
           <w:b/>
           <w:sz w:val="36"/>
           <w:szCs w:val="36"/>
+          <w:lang w:val="vi-VN"/>
         </w:rPr>
         <w:t>BỘ GIÁO DỤC VÀ ĐÀO TẠO</w:t>
       </w:r>
@@ -638,7 +654,7 @@
           <w:lang w:val="vi-VN" w:eastAsia="vi-VN"/>
         </w:rPr>
         <w:drawing>
-          <wp:inline distT="0" distB="0" distL="0" distR="0" wp14:anchorId="73D12BE9" wp14:editId="3A8E8953">
+          <wp:inline distT="0" distB="0" distL="0" distR="0" wp14:anchorId="36773CAB" wp14:editId="175F2CA3">
             <wp:extent cx="828675" cy="762000"/>
             <wp:effectExtent l="0" t="0" r="9525" b="0"/>
             <wp:docPr id="2" name="Picture 2"/>
@@ -855,6 +871,7 @@
           <w:b/>
           <w:sz w:val="32"/>
           <w:szCs w:val="32"/>
+          <w:lang w:val="vi-VN"/>
         </w:rPr>
       </w:pPr>
     </w:p>
@@ -871,14 +888,16 @@
           <w:b/>
           <w:sz w:val="32"/>
           <w:szCs w:val="32"/>
-        </w:rPr>
-      </w:pPr>
-      <w:r>
-        <w:rPr>
-          <w:rFonts w:ascii="Times New Roman" w:hAnsi="Times New Roman" w:cs="Times New Roman"/>
-          <w:b/>
-          <w:sz w:val="32"/>
-          <w:szCs w:val="32"/>
+          <w:lang w:val="vi-VN"/>
+        </w:rPr>
+      </w:pPr>
+      <w:r>
+        <w:rPr>
+          <w:rFonts w:ascii="Times New Roman" w:hAnsi="Times New Roman" w:cs="Times New Roman"/>
+          <w:b/>
+          <w:sz w:val="32"/>
+          <w:szCs w:val="32"/>
+          <w:lang w:val="vi-VN"/>
         </w:rPr>
         <w:t>Tên đề tài</w:t>
       </w:r>
@@ -906,8 +925,9 @@
           <w:b/>
           <w:sz w:val="38"/>
           <w:szCs w:val="38"/>
-        </w:rPr>
-        <w:t>XÂY DỰ</w:t>
+          <w:lang w:val="vi-VN"/>
+        </w:rPr>
+        <w:t xml:space="preserve">XÂY DỰNG </w:t>
       </w:r>
       <w:r>
         <w:rPr>
@@ -915,15 +935,6 @@
           <w:b/>
           <w:sz w:val="38"/>
           <w:szCs w:val="38"/>
-        </w:rPr>
-        <w:t xml:space="preserve">NG </w:t>
-      </w:r>
-      <w:r>
-        <w:rPr>
-          <w:rFonts w:ascii="Times New Roman" w:hAnsi="Times New Roman" w:cs="Times New Roman"/>
-          <w:b/>
-          <w:sz w:val="38"/>
-          <w:szCs w:val="38"/>
           <w:lang w:val="vi-VN"/>
         </w:rPr>
         <w:t>HỆ THỐNG DISHNET - NỀN TẢNG MẠNG XÃ HỘI KINH DOANH ẨM THỰC</w:t>
@@ -942,6 +953,7 @@
           <w:b/>
           <w:sz w:val="32"/>
           <w:szCs w:val="32"/>
+          <w:lang w:val="vi-VN"/>
         </w:rPr>
       </w:pPr>
     </w:p>
@@ -959,14 +971,16 @@
           <w:b/>
           <w:sz w:val="32"/>
           <w:szCs w:val="32"/>
-        </w:rPr>
-      </w:pPr>
-      <w:r>
-        <w:rPr>
-          <w:rFonts w:ascii="Times New Roman" w:hAnsi="Times New Roman" w:cs="Times New Roman"/>
-          <w:b/>
-          <w:sz w:val="32"/>
-          <w:szCs w:val="32"/>
+          <w:lang w:val="vi-VN"/>
+        </w:rPr>
+      </w:pPr>
+      <w:r>
+        <w:rPr>
+          <w:rFonts w:ascii="Times New Roman" w:hAnsi="Times New Roman" w:cs="Times New Roman"/>
+          <w:b/>
+          <w:sz w:val="32"/>
+          <w:szCs w:val="32"/>
+          <w:lang w:val="vi-VN"/>
         </w:rPr>
         <w:t>GIẢNG VIÊN HƯỚNG DẪN</w:t>
       </w:r>
@@ -985,14 +999,16 @@
           <w:b/>
           <w:sz w:val="32"/>
           <w:szCs w:val="32"/>
-        </w:rPr>
-      </w:pPr>
-      <w:r>
-        <w:rPr>
-          <w:rFonts w:ascii="Times New Roman" w:hAnsi="Times New Roman" w:cs="Times New Roman"/>
-          <w:b/>
-          <w:sz w:val="32"/>
-          <w:szCs w:val="32"/>
+          <w:lang w:val="vi-VN"/>
+        </w:rPr>
+      </w:pPr>
+      <w:r>
+        <w:rPr>
+          <w:rFonts w:ascii="Times New Roman" w:hAnsi="Times New Roman" w:cs="Times New Roman"/>
+          <w:b/>
+          <w:sz w:val="32"/>
+          <w:szCs w:val="32"/>
+          <w:lang w:val="vi-VN"/>
         </w:rPr>
         <w:t>ThS. NGUYỄN MINH NHẬT</w:t>
       </w:r>
@@ -1010,6 +1026,7 @@
           <w:rFonts w:ascii="Times New Roman" w:hAnsi="Times New Roman" w:cs="Times New Roman"/>
           <w:sz w:val="32"/>
           <w:szCs w:val="32"/>
+          <w:lang w:val="vi-VN"/>
         </w:rPr>
       </w:pPr>
     </w:p>
@@ -1026,6 +1043,7 @@
           <w:rFonts w:ascii="Times New Roman" w:hAnsi="Times New Roman" w:cs="Times New Roman"/>
           <w:sz w:val="32"/>
           <w:szCs w:val="32"/>
+          <w:lang w:val="vi-VN"/>
         </w:rPr>
       </w:pPr>
     </w:p>
@@ -1043,13 +1061,15 @@
           <w:b/>
           <w:sz w:val="40"/>
           <w:szCs w:val="40"/>
-        </w:rPr>
-      </w:pPr>
-      <w:r>
-        <w:rPr>
-          <w:rFonts w:ascii="Times New Roman" w:hAnsi="Times New Roman" w:cs="Times New Roman"/>
-          <w:sz w:val="32"/>
-          <w:szCs w:val="32"/>
+          <w:lang w:val="vi-VN"/>
+        </w:rPr>
+      </w:pPr>
+      <w:r>
+        <w:rPr>
+          <w:rFonts w:ascii="Times New Roman" w:hAnsi="Times New Roman" w:cs="Times New Roman"/>
+          <w:sz w:val="32"/>
+          <w:szCs w:val="32"/>
+          <w:lang w:val="vi-VN"/>
         </w:rPr>
         <w:t>Đà Nẵ</w:t>
       </w:r>
@@ -1058,6 +1078,7 @@
           <w:rFonts w:ascii="Times New Roman" w:hAnsi="Times New Roman" w:cs="Times New Roman"/>
           <w:sz w:val="32"/>
           <w:szCs w:val="32"/>
+          <w:lang w:val="vi-VN"/>
         </w:rPr>
         <w:t xml:space="preserve">ng, </w:t>
       </w:r>
@@ -1076,6 +1097,7 @@
           <w:b/>
           <w:sz w:val="40"/>
           <w:szCs w:val="40"/>
+          <w:lang w:val="vi-VN"/>
         </w:rPr>
         <w:br w:type="page"/>
       </w:r>
@@ -1089,6 +1111,7 @@
           <w:b/>
           <w:sz w:val="40"/>
           <w:szCs w:val="40"/>
+          <w:lang w:val="vi-VN"/>
         </w:rPr>
       </w:pPr>
       <w:r>
@@ -1097,6 +1120,7 @@
           <w:b/>
           <w:sz w:val="40"/>
           <w:szCs w:val="40"/>
+          <w:lang w:val="vi-VN"/>
         </w:rPr>
         <w:lastRenderedPageBreak/>
         <w:t xml:space="preserve">LỜI </w:t>
@@ -1111,14 +1135,13 @@
         </w:rPr>
         <w:t>CẢM</w:t>
       </w:r>
-      <w:bookmarkStart w:id="0" w:name="_GoBack"/>
-      <w:bookmarkEnd w:id="0"/>
       <w:r>
         <w:rPr>
           <w:rFonts w:ascii="Times New Roman" w:hAnsi="Times New Roman" w:cs="Times New Roman"/>
           <w:b/>
           <w:sz w:val="40"/>
           <w:szCs w:val="40"/>
+          <w:lang w:val="vi-VN"/>
         </w:rPr>
         <w:t xml:space="preserve"> ƠN</w:t>
       </w:r>
@@ -1132,29 +1155,24 @@
           <w:rFonts w:ascii="Times New Roman" w:hAnsi="Times New Roman" w:cs="Times New Roman"/>
           <w:sz w:val="26"/>
           <w:szCs w:val="26"/>
-        </w:rPr>
-      </w:pPr>
-      <w:r>
-        <w:rPr>
-          <w:rFonts w:ascii="Times New Roman" w:hAnsi="Times New Roman" w:cs="Times New Roman"/>
-          <w:sz w:val="26"/>
-          <w:szCs w:val="26"/>
-        </w:rPr>
-        <w:t>Trong suốt quá trình thực hiện đồ án</w:t>
-      </w:r>
-      <w:r>
-        <w:rPr>
-          <w:rFonts w:ascii="Times New Roman" w:hAnsi="Times New Roman" w:cs="Times New Roman"/>
-          <w:sz w:val="26"/>
-          <w:szCs w:val="26"/>
-        </w:rPr>
-        <w:t>, nhóm chúng em đã may mắn có được sự hỗ trợ, giúp đỡ từ phía thầy cô, bạn bè, gia đình. Với lòng biết ơn sâu sắc nhất, em xin gửi đến quý Thầy Cô ở</w:t>
-      </w:r>
-      <w:r>
-        <w:rPr>
-          <w:rFonts w:ascii="Times New Roman" w:hAnsi="Times New Roman" w:cs="Times New Roman"/>
-          <w:sz w:val="26"/>
-          <w:szCs w:val="26"/>
+          <w:lang w:val="vi-VN"/>
+        </w:rPr>
+      </w:pPr>
+      <w:r>
+        <w:rPr>
+          <w:rFonts w:ascii="Times New Roman" w:hAnsi="Times New Roman" w:cs="Times New Roman"/>
+          <w:sz w:val="26"/>
+          <w:szCs w:val="26"/>
+          <w:lang w:val="vi-VN"/>
+        </w:rPr>
+        <w:t>Trong suốt quá trình thực hiện đồ án, nhóm chúng em đã may mắn có được sự hỗ trợ, giúp đỡ từ phía thầy cô, bạn bè, gia đình. Với lòng biết ơn sâu sắc nhất, em xin gửi đến quý Thầy Cô ở</w:t>
+      </w:r>
+      <w:r>
+        <w:rPr>
+          <w:rFonts w:ascii="Times New Roman" w:hAnsi="Times New Roman" w:cs="Times New Roman"/>
+          <w:sz w:val="26"/>
+          <w:szCs w:val="26"/>
+          <w:lang w:val="vi-VN"/>
         </w:rPr>
         <w:t xml:space="preserve"> khoa CNTT </w:t>
       </w:r>
@@ -1163,6 +1181,7 @@
           <w:rFonts w:ascii="Times New Roman" w:hAnsi="Times New Roman" w:cs="Times New Roman"/>
           <w:sz w:val="26"/>
           <w:szCs w:val="26"/>
+          <w:lang w:val="vi-VN"/>
         </w:rPr>
         <w:t>Đại học Duy Tân lời cảm ơn chân thành nhất, vì những tâm huyết và thời gian mà quý Thầy Cô đã bỏ ra để truyền đạt lại vốn kiến thức quý báu cho chúng em trong suốt quãng thời gian học tại trường.</w:t>
       </w:r>
@@ -1176,31 +1195,17 @@
           <w:rFonts w:ascii="Times New Roman" w:hAnsi="Times New Roman" w:cs="Times New Roman"/>
           <w:sz w:val="26"/>
           <w:szCs w:val="26"/>
-        </w:rPr>
-      </w:pPr>
-      <w:r>
-        <w:rPr>
-          <w:rFonts w:ascii="Times New Roman" w:hAnsi="Times New Roman" w:cs="Times New Roman"/>
-          <w:sz w:val="26"/>
-          <w:szCs w:val="26"/>
-        </w:rPr>
-        <w:t>Chúng em xin gửi lời cảm ơn đặc biệt đến thầy Nguyễn Minh Nhật với vai trò là giảng viên hướng dẫn, đã tận tâm chỉ bảo cho chúng em qua từng buổi học hướng dẫn tại trường cũng như trả lời mọi thắc mắc khi chúng em cần. Một lần nữa chúng</w:t>
-      </w:r>
-      <w:r>
-        <w:rPr>
-          <w:rFonts w:ascii="Times New Roman" w:hAnsi="Times New Roman" w:cs="Times New Roman"/>
-          <w:sz w:val="26"/>
-          <w:szCs w:val="26"/>
-        </w:rPr>
-        <w:t xml:space="preserve"> </w:t>
-      </w:r>
-      <w:r>
-        <w:rPr>
-          <w:rFonts w:ascii="Times New Roman" w:hAnsi="Times New Roman" w:cs="Times New Roman"/>
-          <w:sz w:val="26"/>
-          <w:szCs w:val="26"/>
-        </w:rPr>
-        <w:t>em xin chân thành cảm ơn thầy.</w:t>
+          <w:lang w:val="vi-VN"/>
+        </w:rPr>
+      </w:pPr>
+      <w:r>
+        <w:rPr>
+          <w:rFonts w:ascii="Times New Roman" w:hAnsi="Times New Roman" w:cs="Times New Roman"/>
+          <w:sz w:val="26"/>
+          <w:szCs w:val="26"/>
+          <w:lang w:val="vi-VN"/>
+        </w:rPr>
+        <w:t>Chúng em xin gửi lời cảm ơn đặc biệt đến thầy Nguyễn Minh Nhật với vai trò là giảng viên hướng dẫn, đã tận tâm chỉ bảo cho chúng em qua từng buổi học hướng dẫn tại trường cũng như trả lời mọi thắc mắc khi chúng em cần. Một lần nữa chúng em xin chân thành cảm ơn thầy.</w:t>
       </w:r>
     </w:p>
     <w:p>
@@ -1212,13 +1217,15 @@
           <w:rFonts w:ascii="Times New Roman" w:hAnsi="Times New Roman" w:cs="Times New Roman"/>
           <w:sz w:val="26"/>
           <w:szCs w:val="26"/>
-        </w:rPr>
-      </w:pPr>
-      <w:r>
-        <w:rPr>
-          <w:rFonts w:ascii="Times New Roman" w:hAnsi="Times New Roman" w:cs="Times New Roman"/>
-          <w:sz w:val="26"/>
-          <w:szCs w:val="26"/>
+          <w:lang w:val="vi-VN"/>
+        </w:rPr>
+      </w:pPr>
+      <w:r>
+        <w:rPr>
+          <w:rFonts w:ascii="Times New Roman" w:hAnsi="Times New Roman" w:cs="Times New Roman"/>
+          <w:sz w:val="26"/>
+          <w:szCs w:val="26"/>
+          <w:lang w:val="vi-VN"/>
         </w:rPr>
         <w:t>Chúng em rất mong nhận được những ý kiến đóng góp thẳng thắn của các thầy cô để kiến thức của em trong lĩnh vực này đươc hoàn thiện hơn. Sau cùng, em xin chúc quý Thầy Cô thật dồi dào sức khỏe để có thể tiếp tục sứ mệnh cao đẹp trên con đường truyền đạt kiến thức cho thế hệ mai sau.</w:t>
       </w:r>
@@ -1232,6 +1239,7 @@
           <w:rFonts w:ascii="Times New Roman" w:hAnsi="Times New Roman" w:cs="Times New Roman"/>
           <w:sz w:val="26"/>
           <w:szCs w:val="26"/>
+          <w:lang w:val="vi-VN"/>
         </w:rPr>
       </w:pPr>
     </w:p>
@@ -1247,6 +1255,7 @@
           <w:rFonts w:ascii="Times New Roman" w:hAnsi="Times New Roman" w:cs="Times New Roman"/>
           <w:sz w:val="26"/>
           <w:szCs w:val="26"/>
+          <w:lang w:val="vi-VN"/>
         </w:rPr>
       </w:pPr>
     </w:p>
@@ -1262,13 +1271,15 @@
           <w:rFonts w:ascii="Times New Roman" w:hAnsi="Times New Roman" w:cs="Times New Roman"/>
           <w:sz w:val="26"/>
           <w:szCs w:val="26"/>
-        </w:rPr>
-      </w:pPr>
-      <w:r>
-        <w:rPr>
-          <w:rFonts w:ascii="Times New Roman" w:hAnsi="Times New Roman" w:cs="Times New Roman"/>
-          <w:sz w:val="26"/>
-          <w:szCs w:val="26"/>
+          <w:lang w:val="vi-VN"/>
+        </w:rPr>
+      </w:pPr>
+      <w:r>
+        <w:rPr>
+          <w:rFonts w:ascii="Times New Roman" w:hAnsi="Times New Roman" w:cs="Times New Roman"/>
+          <w:sz w:val="26"/>
+          <w:szCs w:val="26"/>
+          <w:lang w:val="vi-VN"/>
         </w:rPr>
         <w:tab/>
         <w:t>Đà Nẵ</w:t>
@@ -1278,6 +1289,7 @@
           <w:rFonts w:ascii="Times New Roman" w:hAnsi="Times New Roman" w:cs="Times New Roman"/>
           <w:sz w:val="26"/>
           <w:szCs w:val="26"/>
+          <w:lang w:val="vi-VN"/>
         </w:rPr>
         <w:t>ng, ngày</w:t>
       </w:r>
@@ -1295,6 +1307,7 @@
           <w:rFonts w:ascii="Times New Roman" w:hAnsi="Times New Roman" w:cs="Times New Roman"/>
           <w:sz w:val="26"/>
           <w:szCs w:val="26"/>
+          <w:lang w:val="vi-VN"/>
         </w:rPr>
         <w:t xml:space="preserve">tháng </w:t>
       </w:r>
@@ -1312,6 +1325,7 @@
           <w:rFonts w:ascii="Times New Roman" w:hAnsi="Times New Roman" w:cs="Times New Roman"/>
           <w:sz w:val="26"/>
           <w:szCs w:val="26"/>
+          <w:lang w:val="vi-VN"/>
         </w:rPr>
         <w:t xml:space="preserve"> năm </w:t>
       </w:r>
@@ -1338,13 +1352,15 @@
           <w:b/>
           <w:sz w:val="26"/>
           <w:szCs w:val="26"/>
-        </w:rPr>
-      </w:pPr>
-      <w:r>
-        <w:rPr>
-          <w:rFonts w:ascii="Times New Roman" w:hAnsi="Times New Roman" w:cs="Times New Roman"/>
-          <w:sz w:val="26"/>
-          <w:szCs w:val="26"/>
+          <w:lang w:val="vi-VN"/>
+        </w:rPr>
+      </w:pPr>
+      <w:r>
+        <w:rPr>
+          <w:rFonts w:ascii="Times New Roman" w:hAnsi="Times New Roman" w:cs="Times New Roman"/>
+          <w:sz w:val="26"/>
+          <w:szCs w:val="26"/>
+          <w:lang w:val="vi-VN"/>
         </w:rPr>
         <w:tab/>
       </w:r>
@@ -1354,6 +1370,7 @@
           <w:b/>
           <w:sz w:val="26"/>
           <w:szCs w:val="26"/>
+          <w:lang w:val="vi-VN"/>
         </w:rPr>
         <w:t>Nhóm sinh viên thực hiện</w:t>
       </w:r>
@@ -1380,6 +1397,7 @@
           <w:b/>
           <w:sz w:val="26"/>
           <w:szCs w:val="26"/>
+          <w:lang w:val="vi-VN"/>
         </w:rPr>
         <w:tab/>
       </w:r>
@@ -1514,14 +1532,16 @@
           <w:rFonts w:ascii="Times New Roman" w:hAnsi="Times New Roman" w:cs="Times New Roman"/>
           <w:sz w:val="26"/>
           <w:szCs w:val="26"/>
-        </w:rPr>
-      </w:pPr>
-      <w:r>
-        <w:rPr>
-          <w:rFonts w:ascii="Times New Roman" w:hAnsi="Times New Roman" w:cs="Times New Roman"/>
-          <w:b/>
-          <w:sz w:val="26"/>
-          <w:szCs w:val="26"/>
+          <w:lang w:val="vi-VN"/>
+        </w:rPr>
+      </w:pPr>
+      <w:r>
+        <w:rPr>
+          <w:rFonts w:ascii="Times New Roman" w:hAnsi="Times New Roman" w:cs="Times New Roman"/>
+          <w:b/>
+          <w:sz w:val="26"/>
+          <w:szCs w:val="26"/>
+          <w:lang w:val="vi-VN"/>
         </w:rPr>
         <w:tab/>
       </w:r>
@@ -1535,22 +1555,25 @@
           <w:rFonts w:ascii="Times New Roman" w:hAnsi="Times New Roman" w:cs="Times New Roman"/>
           <w:sz w:val="26"/>
           <w:szCs w:val="26"/>
-        </w:rPr>
-      </w:pPr>
-    </w:p>
-    <w:p>
-      <w:pPr>
-        <w:rPr>
-          <w:rFonts w:ascii="Times New Roman" w:hAnsi="Times New Roman" w:cs="Times New Roman"/>
-          <w:sz w:val="32"/>
-          <w:szCs w:val="32"/>
-        </w:rPr>
-      </w:pPr>
-      <w:r>
-        <w:rPr>
-          <w:rFonts w:ascii="Times New Roman" w:hAnsi="Times New Roman" w:cs="Times New Roman"/>
-          <w:sz w:val="32"/>
-          <w:szCs w:val="32"/>
+          <w:lang w:val="vi-VN"/>
+        </w:rPr>
+      </w:pPr>
+    </w:p>
+    <w:p>
+      <w:pPr>
+        <w:rPr>
+          <w:rFonts w:ascii="Times New Roman" w:hAnsi="Times New Roman" w:cs="Times New Roman"/>
+          <w:sz w:val="32"/>
+          <w:szCs w:val="32"/>
+          <w:lang w:val="vi-VN"/>
+        </w:rPr>
+      </w:pPr>
+      <w:r>
+        <w:rPr>
+          <w:rFonts w:ascii="Times New Roman" w:hAnsi="Times New Roman" w:cs="Times New Roman"/>
+          <w:sz w:val="32"/>
+          <w:szCs w:val="32"/>
+          <w:lang w:val="vi-VN"/>
         </w:rPr>
         <w:br w:type="page"/>
       </w:r>
@@ -1639,6 +1662,15 @@
         </w:rPr>
         <w:t>Nguyễn Minh Nhật</w:t>
       </w:r>
+      <w:r>
+        <w:rPr>
+          <w:rFonts w:ascii="Times New Roman" w:hAnsi="Times New Roman" w:cs="Times New Roman"/>
+          <w:i/>
+          <w:sz w:val="26"/>
+          <w:szCs w:val="26"/>
+        </w:rPr>
+        <w:t>.</w:t>
+      </w:r>
     </w:p>
     <w:p>
       <w:pPr>
@@ -1689,6 +1721,15 @@
         </w:rPr>
         <w:t>Mọi sao chép không hợp lệ, vi phạm quy chế đào tạo, hay gian trá, tôi xin chịu hoàn toàn trách nhiệm</w:t>
       </w:r>
+      <w:r>
+        <w:rPr>
+          <w:rFonts w:ascii="Times New Roman" w:hAnsi="Times New Roman" w:cs="Times New Roman"/>
+          <w:i/>
+          <w:sz w:val="26"/>
+          <w:szCs w:val="26"/>
+        </w:rPr>
+        <w:t>.</w:t>
+      </w:r>
     </w:p>
     <w:p>
       <w:pPr>
@@ -1731,6 +1772,7 @@
         </w:rPr>
         <w:t xml:space="preserve">ng, ngày </w:t>
       </w:r>
+      <w:proofErr w:type="gramStart"/>
       <w:r>
         <w:rPr>
           <w:rFonts w:ascii="Times New Roman" w:hAnsi="Times New Roman" w:cs="Times New Roman"/>
@@ -1740,6 +1782,7 @@
         </w:rPr>
         <w:t>.....</w:t>
       </w:r>
+      <w:proofErr w:type="gramEnd"/>
       <w:r>
         <w:rPr>
           <w:rFonts w:ascii="Times New Roman" w:hAnsi="Times New Roman" w:cs="Times New Roman"/>
@@ -1748,6 +1791,7 @@
         </w:rPr>
         <w:t xml:space="preserve"> tháng </w:t>
       </w:r>
+      <w:proofErr w:type="gramStart"/>
       <w:r>
         <w:rPr>
           <w:rFonts w:ascii="Times New Roman" w:hAnsi="Times New Roman" w:cs="Times New Roman"/>
@@ -1757,6 +1801,7 @@
         </w:rPr>
         <w:t>.....</w:t>
       </w:r>
+      <w:proofErr w:type="gramEnd"/>
       <w:r>
         <w:rPr>
           <w:rFonts w:ascii="Times New Roman" w:hAnsi="Times New Roman" w:cs="Times New Roman"/>
@@ -1964,14 +2009,16 @@
           <w:rFonts w:ascii="Times New Roman" w:hAnsi="Times New Roman" w:cs="Times New Roman"/>
           <w:sz w:val="26"/>
           <w:szCs w:val="26"/>
-        </w:rPr>
-      </w:pPr>
-      <w:r>
-        <w:rPr>
-          <w:rFonts w:ascii="Times New Roman" w:hAnsi="Times New Roman" w:cs="Times New Roman"/>
-          <w:b/>
-          <w:sz w:val="26"/>
-          <w:szCs w:val="26"/>
+          <w:lang w:val="vi-VN"/>
+        </w:rPr>
+      </w:pPr>
+      <w:r>
+        <w:rPr>
+          <w:rFonts w:ascii="Times New Roman" w:hAnsi="Times New Roman" w:cs="Times New Roman"/>
+          <w:b/>
+          <w:sz w:val="26"/>
+          <w:szCs w:val="26"/>
+          <w:lang w:val="vi-VN"/>
         </w:rPr>
         <w:tab/>
       </w:r>
@@ -1982,6 +2029,7 @@
           <w:rFonts w:ascii="Times New Roman" w:hAnsi="Times New Roman" w:cs="Times New Roman"/>
           <w:sz w:val="32"/>
           <w:szCs w:val="32"/>
+          <w:lang w:val="vi-VN"/>
         </w:rPr>
       </w:pPr>
     </w:p>
@@ -1996,7 +2044,7 @@
 </file>
 
 <file path=word/numbering.xml><?xml version="1.0" encoding="utf-8"?>
-<w:numbering xmlns:wpc="http://schemas.microsoft.com/office/word/2010/wordprocessingCanvas" xmlns:cx="http://schemas.microsoft.com/office/drawing/2014/chartex" xmlns:mc="http://schemas.openxmlformats.org/markup-compatibility/2006" xmlns:o="urn:schemas-microsoft-com:office:office" xmlns:r="http://schemas.openxmlformats.org/officeDocument/2006/relationships" xmlns:m="http://schemas.openxmlformats.org/officeDocument/2006/math" xmlns:v="urn:schemas-microsoft-com:vml" xmlns:wp14="http://schemas.microsoft.com/office/word/2010/wordprocessingDrawing" xmlns:wp="http://schemas.openxmlformats.org/drawingml/2006/wordprocessingDrawing" xmlns:w10="urn:schemas-microsoft-com:office:word" xmlns:w="http://schemas.openxmlformats.org/wordprocessingml/2006/main" xmlns:w14="http://schemas.microsoft.com/office/word/2010/wordml" xmlns:w15="http://schemas.microsoft.com/office/word/2012/wordml" xmlns:w16se="http://schemas.microsoft.com/office/word/2015/wordml/symex" xmlns:wpg="http://schemas.microsoft.com/office/word/2010/wordprocessingGroup" xmlns:wpi="http://schemas.microsoft.com/office/word/2010/wordprocessingInk" xmlns:wne="http://schemas.microsoft.com/office/word/2006/wordml" xmlns:wps="http://schemas.microsoft.com/office/word/2010/wordprocessingShape" mc:Ignorable="w14 w15 w16se wp14">
+<w:numbering xmlns:wpc="http://schemas.microsoft.com/office/word/2010/wordprocessingCanvas" xmlns:cx="http://schemas.microsoft.com/office/drawing/2014/chartex" xmlns:cx1="http://schemas.microsoft.com/office/drawing/2015/9/8/chartex" xmlns:cx2="http://schemas.microsoft.com/office/drawing/2015/10/21/chartex" xmlns:cx3="http://schemas.microsoft.com/office/drawing/2016/5/9/chartex" xmlns:cx4="http://schemas.microsoft.com/office/drawing/2016/5/10/chartex" xmlns:cx5="http://schemas.microsoft.com/office/drawing/2016/5/11/chartex" xmlns:cx6="http://schemas.microsoft.com/office/drawing/2016/5/12/chartex" xmlns:cx7="http://schemas.microsoft.com/office/drawing/2016/5/13/chartex" xmlns:cx8="http://schemas.microsoft.com/office/drawing/2016/5/14/chartex" xmlns:mc="http://schemas.openxmlformats.org/markup-compatibility/2006" xmlns:aink="http://schemas.microsoft.com/office/drawing/2016/ink" xmlns:am3d="http://schemas.microsoft.com/office/drawing/2017/model3d" xmlns:o="urn:schemas-microsoft-com:office:office" xmlns:oel="http://schemas.microsoft.com/office/2019/extlst" xmlns:r="http://schemas.openxmlformats.org/officeDocument/2006/relationships" xmlns:m="http://schemas.openxmlformats.org/officeDocument/2006/math" xmlns:v="urn:schemas-microsoft-com:vml" xmlns:wp14="http://schemas.microsoft.com/office/word/2010/wordprocessingDrawing" xmlns:wp="http://schemas.openxmlformats.org/drawingml/2006/wordprocessingDrawing" xmlns:w10="urn:schemas-microsoft-com:office:word" xmlns:w="http://schemas.openxmlformats.org/wordprocessingml/2006/main" xmlns:w14="http://schemas.microsoft.com/office/word/2010/wordml" xmlns:w15="http://schemas.microsoft.com/office/word/2012/wordml" xmlns:w16cex="http://schemas.microsoft.com/office/word/2018/wordml/cex" xmlns:w16cid="http://schemas.microsoft.com/office/word/2016/wordml/cid" xmlns:w16="http://schemas.microsoft.com/office/word/2018/wordml" xmlns:w16du="http://schemas.microsoft.com/office/word/2023/wordml/word16du" xmlns:w16sdtdh="http://schemas.microsoft.com/office/word/2020/wordml/sdtdatahash" xmlns:w16sdtfl="http://schemas.microsoft.com/office/word/2024/wordml/sdtformatlock" xmlns:w16se="http://schemas.microsoft.com/office/word/2015/wordml/symex" xmlns:wpg="http://schemas.microsoft.com/office/word/2010/wordprocessingGroup" xmlns:wpi="http://schemas.microsoft.com/office/word/2010/wordprocessingInk" xmlns:wne="http://schemas.microsoft.com/office/word/2006/wordml" xmlns:wps="http://schemas.microsoft.com/office/word/2010/wordprocessingShape" mc:Ignorable="w14 w15 w16se w16cid w16 w16cex w16sdtdh w16sdtfl w16du wp14">
   <w:abstractNum w:abstractNumId="0" w15:restartNumberingAfterBreak="0">
     <w:nsid w:val="2CFD2C4F"/>
     <w:multiLevelType w:val="hybridMultilevel"/>
@@ -2083,14 +2131,14 @@
       </w:pPr>
     </w:lvl>
   </w:abstractNum>
-  <w:num w:numId="1">
+  <w:num w:numId="1" w16cid:durableId="2009209913">
     <w:abstractNumId w:val="0"/>
   </w:num>
 </w:numbering>
 </file>
 
 <file path=word/styles.xml><?xml version="1.0" encoding="utf-8"?>
-<w:styles xmlns:mc="http://schemas.openxmlformats.org/markup-compatibility/2006" xmlns:r="http://schemas.openxmlformats.org/officeDocument/2006/relationships" xmlns:w="http://schemas.openxmlformats.org/wordprocessingml/2006/main" xmlns:w14="http://schemas.microsoft.com/office/word/2010/wordml" xmlns:w15="http://schemas.microsoft.com/office/word/2012/wordml" xmlns:w16se="http://schemas.microsoft.com/office/word/2015/wordml/symex" mc:Ignorable="w14 w15 w16se">
+<w:styles xmlns:mc="http://schemas.openxmlformats.org/markup-compatibility/2006" xmlns:r="http://schemas.openxmlformats.org/officeDocument/2006/relationships" xmlns:w="http://schemas.openxmlformats.org/wordprocessingml/2006/main" xmlns:w14="http://schemas.microsoft.com/office/word/2010/wordml" xmlns:w15="http://schemas.microsoft.com/office/word/2012/wordml" xmlns:w16cex="http://schemas.microsoft.com/office/word/2018/wordml/cex" xmlns:w16cid="http://schemas.microsoft.com/office/word/2016/wordml/cid" xmlns:w16="http://schemas.microsoft.com/office/word/2018/wordml" xmlns:w16du="http://schemas.microsoft.com/office/word/2023/wordml/word16du" xmlns:w16sdtdh="http://schemas.microsoft.com/office/word/2020/wordml/sdtdatahash" xmlns:w16sdtfl="http://schemas.microsoft.com/office/word/2024/wordml/sdtformatlock" xmlns:w16se="http://schemas.microsoft.com/office/word/2015/wordml/symex" mc:Ignorable="w14 w15 w16se w16cid w16 w16cex w16sdtdh w16sdtfl w16du">
   <w:docDefaults>
     <w:rPrDefault>
       <w:rPr>
@@ -2106,7 +2154,7 @@
       </w:pPr>
     </w:pPrDefault>
   </w:docDefaults>
-  <w:latentStyles w:defLockedState="0" w:defUIPriority="99" w:defSemiHidden="0" w:defUnhideWhenUsed="0" w:defQFormat="0" w:count="371">
+  <w:latentStyles w:defLockedState="0" w:defUIPriority="99" w:defSemiHidden="0" w:defUnhideWhenUsed="0" w:defQFormat="0" w:count="376">
     <w:lsdException w:name="Normal" w:uiPriority="0" w:qFormat="1"/>
     <w:lsdException w:name="heading 1" w:uiPriority="9" w:qFormat="1"/>
     <w:lsdException w:name="heading 2" w:semiHidden="1" w:uiPriority="9" w:unhideWhenUsed="1" w:qFormat="1"/>
@@ -2478,6 +2526,11 @@
     <w:lsdException w:name="List Table 5 Dark Accent 6" w:uiPriority="50"/>
     <w:lsdException w:name="List Table 6 Colorful Accent 6" w:uiPriority="51"/>
     <w:lsdException w:name="List Table 7 Colorful Accent 6" w:uiPriority="52"/>
+    <w:lsdException w:name="Mention" w:semiHidden="1" w:unhideWhenUsed="1"/>
+    <w:lsdException w:name="Smart Hyperlink" w:semiHidden="1" w:unhideWhenUsed="1"/>
+    <w:lsdException w:name="Hashtag" w:semiHidden="1" w:unhideWhenUsed="1"/>
+    <w:lsdException w:name="Unresolved Mention" w:semiHidden="1" w:unhideWhenUsed="1"/>
+    <w:lsdException w:name="Smart Link" w:semiHidden="1" w:unhideWhenUsed="1"/>
   </w:latentStyles>
   <w:style w:type="paragraph" w:default="1" w:styleId="Normal">
     <w:name w:val="Normal"/>

</xml_diff>